<commit_message>
Normalize DOCX merge: A4 format, tab handling, content cleanup
- Fix template to A4 with 2cm margins (was US Letter with 3.17cm)
- Fix TestoAtto.docx to match template layout (A4, 2cm, Times New Roman 12pt, justified)
- Add content normalization during injection:
  - Detect fake right-alignment (>3 tabs) and convert to proper right tab stop
  - Make tab stops explicit when source/template defaultTabStop differ
  - Clean space-padding runs used as manual alignment
- Remove stale launch.json entry for non-existent app_simple.py

Co-Authored-By: Claude Opus 4.6 <noreply@anthropic.com>
</commit_message>
<xml_diff>
--- a/template/ASL_Template_Atto.docx
+++ b/template/ASL_Template_Atto.docx
@@ -14,15 +14,7 @@
           <w:bCs/>
           <w:lang w:val="it-IT"/>
         </w:rPr>
-        <w:t>ATTO</w:t>
-      </w:r>
-      <w:r>
-        <w:rPr>
-          <w:b/>
-          <w:bCs/>
-          <w:lang w:val="it-IT"/>
-        </w:rPr>
-        <w:t xml:space="preserve"> N.</w:t>
+        <w:t>ATTO N.</w:t>
       </w:r>
       <w:r>
         <w:rPr>
@@ -212,7 +204,6 @@
         </w:rPr>
         <w:t xml:space="preserve"> </w:t>
       </w:r>
-      <w:proofErr w:type="gramStart"/>
       <w:r>
         <w:rPr>
           <w:b/>
@@ -225,7 +216,13 @@
         <w:rPr>
           <w:lang w:val="it-IT"/>
         </w:rPr>
-        <w:t xml:space="preserve">  </w:t>
+        <w:t xml:space="preserve"> </w:t>
+      </w:r>
+      <w:r>
+        <w:rPr>
+          <w:lang w:val="it-IT"/>
+        </w:rPr>
+        <w:t>$</w:t>
       </w:r>
       <w:r>
         <w:rPr>
@@ -234,7 +231,6 @@
         <w:t>$</w:t>
       </w:r>
       <w:proofErr w:type="spellStart"/>
-      <w:proofErr w:type="gramEnd"/>
       <w:r>
         <w:rPr>
           <w:lang w:val="it-IT"/>
@@ -304,8 +300,8 @@
       </w:r>
     </w:p>
     <w:sectPr>
-      <w:pgSz w:w="12240" w:h="15840"/>
-      <w:pgMar w:top="1440" w:right="1800" w:bottom="1440" w:left="1800" w:header="720" w:footer="720" w:gutter="0"/>
+      <w:pgSz w:w="11906" w:h="16838"/>
+      <w:pgMar w:top="1134" w:right="1134" w:bottom="1134" w:left="1134" w:header="720" w:footer="720" w:gutter="0"/>
       <w:cols w:space="720"/>
       <w:docGrid w:linePitch="360"/>
     </w:sectPr>

</xml_diff>